<commit_message>
Generando pruebas unitarias para  volumen_cilindro_hueco_v1.Rmd
</commit_message>
<xml_diff>
--- a/Lab/36/salida/volumen_cilindro_hueco_v1_1.docx
+++ b/Lab/36/salida/volumen_cilindro_hueco_v1_1.docx
@@ -137,7 +137,7 @@
         <w:br/>
       </w:r>
       <w:r>
-        <w:t xml:space="preserve">Daniela desea saber cuánto fluido se necesita para llenar el conducto interno, pero solamente cuenta con las medidas de las dimensiones que muestra la figura.</w:t>
+        <w:t xml:space="preserve">Mariana desea saber cuánto aceite se necesita para llenar el cilindro interno, pero solamente cuenta con las medidas de las dimensiones que muestra la figura.</w:t>
       </w:r>
     </w:p>
     <w:p>
@@ -150,7 +150,7 @@
       <w:r>
         <w:drawing>
           <wp:inline>
-            <wp:extent cx="5080000" cy="5542280"/>
+            <wp:extent cx="5085080" cy="5537200"/>
             <wp:effectExtent b="0" l="0" r="0" t="0"/>
             <wp:docPr descr="image" title="" id="21" name="Picture"/>
             <a:graphic>
@@ -171,7 +171,7 @@
                   <pic:spPr bwMode="auto">
                     <a:xfrm>
                       <a:off x="0" y="0"/>
-                      <a:ext cx="5080000" cy="5542280"/>
+                      <a:ext cx="5085080" cy="5537200"/>
                     </a:xfrm>
                     <a:prstGeom prst="rect">
                       <a:avLst/>
@@ -198,7 +198,7 @@
         </w:numPr>
       </w:pPr>
       <w:r>
-        <w:t xml:space="preserve">¿Cuál medida le falta a Daniela para hallar la cantidad deseada?</w:t>
+        <w:t xml:space="preserve">¿Cuál medida le falta a Mariana para hallar la cantidad deseada?</w:t>
       </w:r>
     </w:p>
     <w:p>
@@ -209,7 +209,7 @@
         </w:numPr>
       </w:pPr>
       <w:r>
-        <w:t xml:space="preserve">Diámetro externo.</w:t>
+        <w:t xml:space="preserve">Altura del cilindro.</w:t>
       </w:r>
     </w:p>
     <w:p>
@@ -220,7 +220,7 @@
         </w:numPr>
       </w:pPr>
       <w:r>
-        <w:t xml:space="preserve">Altura del cilindro.</w:t>
+        <w:t xml:space="preserve">Radio externo.</w:t>
       </w:r>
     </w:p>
     <w:p>
@@ -231,7 +231,7 @@
         </w:numPr>
       </w:pPr>
       <w:r>
-        <w:t xml:space="preserve">Radio externo.</w:t>
+        <w:t xml:space="preserve">Perímetro del cilindro.</w:t>
       </w:r>
     </w:p>
     <w:p>
@@ -242,7 +242,7 @@
         </w:numPr>
       </w:pPr>
       <w:r>
-        <w:t xml:space="preserve">Perímetro del cilindro.</w:t>
+        <w:t xml:space="preserve">Diámetro externo.</w:t>
       </w:r>
     </w:p>
     <w:p>
@@ -287,7 +287,7 @@
         </w:numPr>
       </w:pPr>
       <w:r>
-        <w:t xml:space="preserve">Para calcular el volumen de fluido necesario para llenar el conducto interno, necesitamos calcular el volumen de un cilindro, cuya fórmula es:</w:t>
+        <w:t xml:space="preserve">Para calcular el volumen de aceite necesario para llenar el cilindro central, necesitamos calcular el volumen de un cilindro, cuya fórmula es:</w:t>
       </w:r>
     </w:p>
     <w:p>
@@ -367,7 +367,7 @@
         <w:t xml:space="preserve"> </w:t>
       </w:r>
       <w:r>
-        <w:t xml:space="preserve">es el radio (en este caso, el radio interno = 13 dm)</w:t>
+        <w:t xml:space="preserve">es el radio (en este caso, el radio interno = 1.8 dm)</w:t>
       </w:r>
       <w:r>
         <w:t xml:space="preserve"> </w:t>
@@ -404,13 +404,13 @@
         <w:t xml:space="preserve"> </w:t>
       </w:r>
       <w:r>
-        <w:t xml:space="preserve">- Diámetro externo = 34 dm</w:t>
-      </w:r>
-      <w:r>
-        <w:t xml:space="preserve"> </w:t>
-      </w:r>
-      <w:r>
-        <w:t xml:space="preserve">- Radio interno = 13 dm</w:t>
+        <w:t xml:space="preserve">- Diámetro externo = 6 dm</w:t>
+      </w:r>
+      <w:r>
+        <w:t xml:space="preserve"> </w:t>
+      </w:r>
+      <w:r>
+        <w:t xml:space="preserve">- Radio interno = 1.8 dm</w:t>
       </w:r>
     </w:p>
     <w:p>
@@ -421,7 +421,7 @@
         </w:numPr>
       </w:pPr>
       <w:r>
-        <w:t xml:space="preserve">Sin embargo, no se nos proporciona la altura del cilindro, que es esencial para calcular el volumen. Por lo tanto, a Daniela le falta conocer la altura del cilindro para poder calcular la cantidad de fluido necesaria.</w:t>
+        <w:t xml:space="preserve">Sin embargo, no se nos proporciona la altura del cilindro, que es esencial para calcular el volumen. Por lo tanto, a Mariana le falta conocer la altura del cilindro para poder calcular la cantidad de aceite necesaria.</w:t>
       </w:r>
     </w:p>
     <w:p>
@@ -467,7 +467,7 @@
               </m:dPr>
               <m:e>
                 <m:r>
-                  <m:t>13</m:t>
+                  <m:t>1.8</m:t>
                 </m:r>
               </m:e>
             </m:d>
@@ -494,7 +494,7 @@
           <m:t>=</m:t>
         </m:r>
         <m:r>
-          <m:t>530.93</m:t>
+          <m:t>10.18</m:t>
         </m:r>
         <m:r>
           <m:rPr>
@@ -521,7 +521,7 @@
         </w:numPr>
       </w:pPr>
       <w:r>
-        <w:t xml:space="preserve">Falso</w:t>
+        <w:t xml:space="preserve">Verdadero</w:t>
       </w:r>
     </w:p>
     <w:p>
@@ -532,7 +532,7 @@
         </w:numPr>
       </w:pPr>
       <w:r>
-        <w:t xml:space="preserve">Verdadero</w:t>
+        <w:t xml:space="preserve">Falso</w:t>
       </w:r>
     </w:p>
     <w:p>
@@ -575,7 +575,7 @@
         <w:br/>
       </w:r>
       <w:r>
-        <w:t xml:space="preserve">Laura desea saber cuánto combustible se necesita para llenar el contenedor cilíndrico interno, pero solamente cuenta con las medidas de las dimensiones que muestra la figura.</w:t>
+        <w:t xml:space="preserve">Valeria desea saber cuánto solución se necesita para llenar el conducto interno, pero solamente cuenta con las medidas de las dimensiones que muestra la figura.</w:t>
       </w:r>
     </w:p>
     <w:p>
@@ -588,7 +588,7 @@
       <w:r>
         <w:drawing>
           <wp:inline>
-            <wp:extent cx="5080000" cy="5542280"/>
+            <wp:extent cx="5085080" cy="5542280"/>
             <wp:effectExtent b="0" l="0" r="0" t="0"/>
             <wp:docPr descr="image" title="" id="24" name="Picture"/>
             <a:graphic>
@@ -609,7 +609,7 @@
                   <pic:spPr bwMode="auto">
                     <a:xfrm>
                       <a:off x="0" y="0"/>
-                      <a:ext cx="5080000" cy="5542280"/>
+                      <a:ext cx="5085080" cy="5542280"/>
                     </a:xfrm>
                     <a:prstGeom prst="rect">
                       <a:avLst/>
@@ -636,7 +636,7 @@
         </w:numPr>
       </w:pPr>
       <w:r>
-        <w:t xml:space="preserve">¿Cuál medida le falta a Laura para hallar la cantidad deseada?</w:t>
+        <w:t xml:space="preserve">¿Cuál medida le falta a Valeria para hallar la cantidad deseada?</w:t>
       </w:r>
     </w:p>
     <w:p>
@@ -647,7 +647,7 @@
         </w:numPr>
       </w:pPr>
       <w:r>
-        <w:t xml:space="preserve">Diámetro externo.</w:t>
+        <w:t xml:space="preserve">Radio externo.</w:t>
       </w:r>
     </w:p>
     <w:p>
@@ -669,7 +669,7 @@
         </w:numPr>
       </w:pPr>
       <w:r>
-        <w:t xml:space="preserve">Radio externo.</w:t>
+        <w:t xml:space="preserve">Diámetro externo.</w:t>
       </w:r>
     </w:p>
     <w:p>
@@ -725,7 +725,7 @@
         </w:numPr>
       </w:pPr>
       <w:r>
-        <w:t xml:space="preserve">Para calcular el volumen de combustible necesario para llenar el contenedor cilíndrico interior, necesitamos calcular el volumen de un cilindro, cuya fórmula es:</w:t>
+        <w:t xml:space="preserve">Para calcular el volumen de solución necesario para llenar el conducto hueco, necesitamos calcular el volumen de un cilindro, cuya fórmula es:</w:t>
       </w:r>
     </w:p>
     <w:p>
@@ -805,7 +805,7 @@
         <w:t xml:space="preserve"> </w:t>
       </w:r>
       <w:r>
-        <w:t xml:space="preserve">es el radio (en este caso, el radio interno = 0.9 m)</w:t>
+        <w:t xml:space="preserve">es el radio (en este caso, el radio interno = 0.2 m)</w:t>
       </w:r>
       <w:r>
         <w:t xml:space="preserve"> </w:t>
@@ -842,13 +842,13 @@
         <w:t xml:space="preserve"> </w:t>
       </w:r>
       <w:r>
-        <w:t xml:space="preserve">- Diámetro externo = 2.4 m</w:t>
-      </w:r>
-      <w:r>
-        <w:t xml:space="preserve"> </w:t>
-      </w:r>
-      <w:r>
-        <w:t xml:space="preserve">- Radio interno = 0.9 m</w:t>
+        <w:t xml:space="preserve">- Diámetro externo = 1 m</w:t>
+      </w:r>
+      <w:r>
+        <w:t xml:space="preserve"> </w:t>
+      </w:r>
+      <w:r>
+        <w:t xml:space="preserve">- Radio interno = 0.2 m</w:t>
       </w:r>
     </w:p>
     <w:p>
@@ -859,7 +859,7 @@
         </w:numPr>
       </w:pPr>
       <w:r>
-        <w:t xml:space="preserve">Sin embargo, no se nos proporciona la altura del cilindro, que es esencial para calcular el volumen. Por lo tanto, a Laura le falta conocer la altura del cilindro para poder calcular la cantidad de combustible necesaria.</w:t>
+        <w:t xml:space="preserve">Sin embargo, no se nos proporciona la altura del cilindro, que es esencial para calcular el volumen. Por lo tanto, a Valeria le falta conocer la altura del cilindro para poder calcular la cantidad de solución necesaria.</w:t>
       </w:r>
     </w:p>
     <w:p>
@@ -905,7 +905,7 @@
               </m:dPr>
               <m:e>
                 <m:r>
-                  <m:t>0.9</m:t>
+                  <m:t>0.2</m:t>
                 </m:r>
               </m:e>
             </m:d>
@@ -932,7 +932,7 @@
           <m:t>=</m:t>
         </m:r>
         <m:r>
-          <m:t>2.54</m:t>
+          <m:t>0.13</m:t>
         </m:r>
         <m:r>
           <m:rPr>

</xml_diff>